<commit_message>
Deployed 4021597 with MkDocs version: 1.6.1
</commit_message>
<xml_diff>
--- a/tema4/plantillas/Actividad_4_1_INU_Plantilla.docx
+++ b/tema4/plantillas/Actividad_4_1_INU_Plantilla.docx
@@ -167,7 +167,7 @@
                 <w:sz w:val="20"/>
                 <w:szCs w:val="20"/>
               </w:rPr>
-              <w:t xml:space="preserve">Identificador de recursos usado (ej. encuestas-asg-&lt;tu-identificador&gt;): _______________________</w:t>
+              <w:t xml:space="preserve">Identificador de recursos usado (ej. escaparate-asg-&lt;tu-identificador&gt;): _______________________</w:t>
             </w:r>
           </w:p>
         </w:tc>
@@ -198,7 +198,7 @@
           <w:sz w:val="26"/>
           <w:szCs w:val="26"/>
         </w:rPr>
-        <w:t xml:space="preserve">Parte A — Balanceador y escalado automático</w:t>
+        <w:t xml:space="preserve">Parte A — De instancia suelta a flota con balanceo y escalado</w:t>
       </w:r>
     </w:p>
     <w:p>
@@ -222,7 +222,7 @@
           <w:sz w:val="24"/>
           <w:szCs w:val="24"/>
         </w:rPr>
-        <w:t xml:space="preserve">Paso 1 — Crea tu plantilla de lanzamiento desde la consola</w:t>
+        <w:t xml:space="preserve">Paso 1 — Prepara una instancia base y captúrala como AMI propia</w:t>
       </w:r>
     </w:p>
     <w:tbl>
@@ -268,7 +268,7 @@
                 <w:sz w:val="20"/>
                 <w:szCs w:val="20"/>
               </w:rPr>
-              <w:t xml:space="preserve">📸 Plantilla de lanzamiento creada, con la AMI, el grupo de seguridad y el user data de Encuestas en Vivo configurados</w:t>
+              <w:t xml:space="preserve">📸 Salida de java -version y ls ~/escaparate.war en la instancia, y tu AMI en estado available con su ID visible</w:t>
             </w:r>
           </w:p>
         </w:tc>
@@ -334,7 +334,7 @@
           <w:sz w:val="24"/>
           <w:szCs w:val="24"/>
         </w:rPr>
-        <w:t xml:space="preserve">Paso 2 — Crea el balanceador y el grupo de destino desde la consola</w:t>
+        <w:t xml:space="preserve">Paso 2 — Crea el sistema de ficheros EFS compartido</w:t>
       </w:r>
     </w:p>
     <w:tbl>
@@ -380,7 +380,7 @@
                 <w:sz w:val="20"/>
                 <w:szCs w:val="20"/>
               </w:rPr>
-              <w:t xml:space="preserve">📸 Balanceador creado, con su listener apuntando al grupo de destino y su comprobación de salud en /salud</w:t>
+              <w:t xml:space="preserve">📸 El sistema de archivos EFS con sus dos puntos de montaje, mostrando el ID de sistema de archivos</w:t>
             </w:r>
           </w:p>
         </w:tc>
@@ -451,7 +451,7 @@
           <w:sz w:val="24"/>
           <w:szCs w:val="24"/>
         </w:rPr>
-        <w:t xml:space="preserve">Paso 3 — Crea el grupo de escalado automático por CLI</w:t>
+        <w:t xml:space="preserve">Paso 3 — Crea el grupo de seguridad de las instancias y del balanceador</w:t>
       </w:r>
     </w:p>
     <w:tbl>
@@ -497,7 +497,7 @@
                 <w:sz w:val="20"/>
                 <w:szCs w:val="20"/>
               </w:rPr>
-              <w:t xml:space="preserve">📸 Grupo de destino con dos instancias en estado healthy, una por zona</w:t>
+              <w:t xml:space="preserve">📸 Las dos reglas de entrada, cada una en su grupo de seguridad, mostrando el origen exacto de cada una</w:t>
             </w:r>
           </w:p>
         </w:tc>
@@ -563,7 +563,7 @@
           <w:sz w:val="24"/>
           <w:szCs w:val="24"/>
         </w:rPr>
-        <w:t xml:space="preserve">Paso 4 — Comprueba el reparto real de tráfico</w:t>
+        <w:t xml:space="preserve">Paso 4 — Crea el grupo de destino y el balanceador</w:t>
       </w:r>
     </w:p>
     <w:tbl>
@@ -609,7 +609,7 @@
                 <w:sz w:val="20"/>
                 <w:szCs w:val="20"/>
               </w:rPr>
-              <w:t xml:space="preserve">📸 Al menos cuatro peticiones consecutivas a la URL del balanceador, mostrando identificadores de instancia distintos</w:t>
+              <w:t xml:space="preserve">📸 Resumen del balanceador con su DNS name visible, y la configuración del listener mostrando el grupo de destino de reenvío</w:t>
             </w:r>
           </w:p>
         </w:tc>
@@ -658,6 +658,11 @@
       <w:pPr>
         <w:spacing w:after="200"/>
       </w:pPr>
+    </w:p>
+    <w:p>
+      <w:r>
+        <w:br w:type="page"/>
+      </w:r>
     </w:p>
     <w:p>
       <w:pPr>
@@ -675,21 +680,7 @@
           <w:sz w:val="24"/>
           <w:szCs w:val="24"/>
         </w:rPr>
-        <w:t xml:space="preserve">Reflexiona</w:t>
-      </w:r>
-    </w:p>
-    <w:p>
-      <w:pPr>
-        <w:spacing w:after="100"/>
-      </w:pPr>
-      <w:r>
-        <w:rPr>
-          <w:rFonts w:ascii="Arial" w:cs="Arial" w:eastAsia="Arial" w:hAnsi="Arial"/>
-          <w:color w:val="212121"/>
-          <w:sz w:val="22"/>
-          <w:szCs w:val="22"/>
-        </w:rPr>
-        <w:t xml:space="preserve">Antes de esta sesión, la URL que usaba cualquier asistente para votar habría sido la IP pública de una instancia concreta. Ahora es la del balanceador. ¿Qué le pasa a un visitante que tuviera guardada la IP antigua de la instancia, y qué te dice eso sobre por qué nunca se debe dar a los usuarios una dirección que apunte directamente a una instancia?</w:t>
+        <w:t xml:space="preserve">Paso 5 — Construye la plantilla de lanzamiento</w:t>
       </w:r>
     </w:p>
     <w:tbl>
@@ -708,8 +699,41 @@
         <w:gridCol w:w="9638"/>
       </w:tblGrid>
       <w:tr>
+        <w:tc>
+          <w:tcPr>
+            <w:tcW w:type="dxa" w:w="9638"/>
+            <w:tcBorders>
+              <w:top w:val="none" w:color="FFFFFF" w:sz="0"/>
+              <w:left w:val="none" w:color="FFFFFF" w:sz="0"/>
+              <w:bottom w:val="none" w:color="FFFFFF" w:sz="0"/>
+              <w:right w:val="none" w:color="FFFFFF" w:sz="0"/>
+            </w:tcBorders>
+            <w:shd w:fill="3949AB" w:val="clear"/>
+            <w:tcMar>
+              <w:top w:type="dxa" w:w="80"/>
+              <w:left w:type="dxa" w:w="160"/>
+              <w:bottom w:type="dxa" w:w="80"/>
+              <w:right w:type="dxa" w:w="160"/>
+            </w:tcMar>
+          </w:tcPr>
+          <w:p>
+            <w:r>
+              <w:rPr>
+                <w:rFonts w:ascii="Arial" w:cs="Arial" w:eastAsia="Arial" w:hAnsi="Arial"/>
+                <w:b/>
+                <w:bCs/>
+                <w:color w:val="FFFFFF"/>
+                <w:sz w:val="20"/>
+                <w:szCs w:val="20"/>
+              </w:rPr>
+              <w:t xml:space="preserve">📸 Resumen de la plantilla mostrando la AMI, los grupos de seguridad y el perfil de IAM</w:t>
+            </w:r>
+          </w:p>
+        </w:tc>
+      </w:tr>
+      <w:tr>
         <w:trPr>
-          <w:trHeight w:val="480"/>
+          <w:trHeight w:val="2400"/>
         </w:trPr>
         <w:tc>
           <w:tcPr>
@@ -722,115 +746,26 @@
             </w:tcBorders>
             <w:shd w:fill="FAFAFA" w:val="clear"/>
             <w:tcMar>
-              <w:top w:type="dxa" w:w="60"/>
-              <w:left w:type="dxa" w:w="160"/>
-              <w:bottom w:type="dxa" w:w="60"/>
-              <w:right w:type="dxa" w:w="160"/>
-            </w:tcMar>
-          </w:tcPr>
-          <w:p>
-            <w:r>
-              <w:rPr>
-                <w:sz w:val="22"/>
-                <w:szCs w:val="22"/>
-              </w:rPr>
-              <w:t xml:space="preserve"/>
-            </w:r>
-          </w:p>
-        </w:tc>
-      </w:tr>
-      <w:tr>
-        <w:trPr>
-          <w:trHeight w:val="480"/>
-        </w:trPr>
-        <w:tc>
-          <w:tcPr>
-            <w:tcW w:type="dxa" w:w="9638"/>
-            <w:tcBorders>
-              <w:top w:val="single" w:color="E0E0E0" w:sz="4"/>
-              <w:left w:val="single" w:color="E0E0E0" w:sz="4"/>
-              <w:bottom w:val="single" w:color="E0E0E0" w:sz="4"/>
-              <w:right w:val="single" w:color="E0E0E0" w:sz="4"/>
-            </w:tcBorders>
-            <w:shd w:fill="FAFAFA" w:val="clear"/>
-            <w:tcMar>
-              <w:top w:type="dxa" w:w="60"/>
-              <w:left w:type="dxa" w:w="160"/>
-              <w:bottom w:type="dxa" w:w="60"/>
-              <w:right w:type="dxa" w:w="160"/>
-            </w:tcMar>
-          </w:tcPr>
-          <w:p>
-            <w:r>
-              <w:rPr>
-                <w:sz w:val="22"/>
-                <w:szCs w:val="22"/>
-              </w:rPr>
-              <w:t xml:space="preserve"/>
-            </w:r>
-          </w:p>
-        </w:tc>
-      </w:tr>
-      <w:tr>
-        <w:trPr>
-          <w:trHeight w:val="480"/>
-        </w:trPr>
-        <w:tc>
-          <w:tcPr>
-            <w:tcW w:type="dxa" w:w="9638"/>
-            <w:tcBorders>
-              <w:top w:val="single" w:color="E0E0E0" w:sz="4"/>
-              <w:left w:val="single" w:color="E0E0E0" w:sz="4"/>
-              <w:bottom w:val="single" w:color="E0E0E0" w:sz="4"/>
-              <w:right w:val="single" w:color="E0E0E0" w:sz="4"/>
-            </w:tcBorders>
-            <w:shd w:fill="FAFAFA" w:val="clear"/>
-            <w:tcMar>
-              <w:top w:type="dxa" w:w="60"/>
-              <w:left w:type="dxa" w:w="160"/>
-              <w:bottom w:type="dxa" w:w="60"/>
-              <w:right w:type="dxa" w:w="160"/>
-            </w:tcMar>
-          </w:tcPr>
-          <w:p>
-            <w:r>
-              <w:rPr>
-                <w:sz w:val="22"/>
-                <w:szCs w:val="22"/>
-              </w:rPr>
-              <w:t xml:space="preserve"/>
-            </w:r>
-          </w:p>
-        </w:tc>
-      </w:tr>
-      <w:tr>
-        <w:trPr>
-          <w:trHeight w:val="480"/>
-        </w:trPr>
-        <w:tc>
-          <w:tcPr>
-            <w:tcW w:type="dxa" w:w="9638"/>
-            <w:tcBorders>
-              <w:top w:val="single" w:color="E0E0E0" w:sz="4"/>
-              <w:left w:val="single" w:color="E0E0E0" w:sz="4"/>
-              <w:bottom w:val="single" w:color="E0E0E0" w:sz="4"/>
-              <w:right w:val="single" w:color="E0E0E0" w:sz="4"/>
-            </w:tcBorders>
-            <w:shd w:fill="FAFAFA" w:val="clear"/>
-            <w:tcMar>
-              <w:top w:type="dxa" w:w="60"/>
-              <w:left w:type="dxa" w:w="160"/>
-              <w:bottom w:type="dxa" w:w="60"/>
-              <w:right w:type="dxa" w:w="160"/>
-            </w:tcMar>
-          </w:tcPr>
-          <w:p>
-            <w:r>
-              <w:rPr>
-                <w:sz w:val="22"/>
-                <w:szCs w:val="22"/>
-              </w:rPr>
-              <w:t xml:space="preserve"/>
+              <w:top w:type="dxa" w:w="80"/>
+              <w:left w:type="dxa" w:w="160"/>
+              <w:bottom w:type="dxa" w:w="80"/>
+              <w:right w:type="dxa" w:w="160"/>
+            </w:tcMar>
+          </w:tcPr>
+          <w:p>
+            <w:pPr>
+              <w:jc w:val="center"/>
+            </w:pPr>
+            <w:r>
+              <w:rPr>
+                <w:rFonts w:ascii="Arial" w:cs="Arial" w:eastAsia="Arial" w:hAnsi="Arial"/>
+                <w:i/>
+                <w:iCs/>
+                <w:color w:val="757575"/>
+                <w:sz w:val="20"/>
+                <w:szCs w:val="20"/>
+              </w:rPr>
+              <w:t xml:space="preserve">[Pega aquí la captura de pantalla]</w:t>
             </w:r>
           </w:p>
         </w:tc>
@@ -839,34 +774,6 @@
     <w:p>
       <w:pPr>
         <w:spacing w:after="200"/>
-      </w:pPr>
-    </w:p>
-    <w:p>
-      <w:r>
-        <w:br w:type="page"/>
-      </w:r>
-    </w:p>
-    <w:p>
-      <w:pPr>
-        <w:shd w:fill="3949AB" w:val="clear"/>
-        <w:spacing w:after="0" w:before="320"/>
-        <w:ind w:left="200" w:right="200"/>
-      </w:pPr>
-      <w:r>
-        <w:rPr>
-          <w:rFonts w:ascii="Arial" w:cs="Arial" w:eastAsia="Arial" w:hAnsi="Arial"/>
-          <w:b/>
-          <w:bCs/>
-          <w:color w:val="FFFFFF"/>
-          <w:sz w:val="26"/>
-          <w:szCs w:val="26"/>
-        </w:rPr>
-        <w:t xml:space="preserve">Parte B — Reto: provoca el fallo y mide el escalado</w:t>
-      </w:r>
-    </w:p>
-    <w:p>
-      <w:pPr>
-        <w:spacing w:after="120"/>
       </w:pPr>
     </w:p>
     <w:p>
@@ -885,21 +792,7 @@
           <w:sz w:val="24"/>
           <w:szCs w:val="24"/>
         </w:rPr>
-        <w:t xml:space="preserve">Termina una instancia a mano</w:t>
-      </w:r>
-    </w:p>
-    <w:p>
-      <w:pPr>
-        <w:spacing w:after="100"/>
-      </w:pPr>
-      <w:r>
-        <w:rPr>
-          <w:rFonts w:ascii="Arial" w:cs="Arial" w:eastAsia="Arial" w:hAnsi="Arial"/>
-          <w:color w:val="212121"/>
-          <w:sz w:val="22"/>
-          <w:szCs w:val="22"/>
-        </w:rPr>
-        <w:t xml:space="preserve">Decide cómo observar la reposición automática y qué evidencia capturar para demostrar que ha ocurrido sin intervención tuya.</w:t>
+        <w:t xml:space="preserve">Paso 6 — Crea el grupo de escalado automático</w:t>
       </w:r>
     </w:p>
     <w:tbl>
@@ -945,7 +838,7 @@
                 <w:sz w:val="20"/>
                 <w:szCs w:val="20"/>
               </w:rPr>
-              <w:t xml:space="preserve">📸 Momento en que terminas la instancia y momento en que el grupo la ha repuesto</w:t>
+              <w:t xml:space="preserve">📸 Grupo de destino con las dos instancias en healthy, y el grupo de escalado automático mostrando capacidad 2/2/4</w:t>
             </w:r>
           </w:p>
         </w:tc>
@@ -992,8 +885,13 @@
     </w:tbl>
     <w:p>
       <w:pPr>
-        <w:spacing w:after="160"/>
-      </w:pPr>
+        <w:spacing w:after="200"/>
+      </w:pPr>
+    </w:p>
+    <w:p>
+      <w:r>
+        <w:br w:type="page"/>
+      </w:r>
     </w:p>
     <w:p>
       <w:pPr>
@@ -1011,21 +909,7 @@
           <w:sz w:val="24"/>
           <w:szCs w:val="24"/>
         </w:rPr>
-        <w:t xml:space="preserve">Genera carga real y mide el escalado</w:t>
-      </w:r>
-    </w:p>
-    <w:p>
-      <w:pPr>
-        <w:spacing w:after="100"/>
-      </w:pPr>
-      <w:r>
-        <w:rPr>
-          <w:rFonts w:ascii="Arial" w:cs="Arial" w:eastAsia="Arial" w:hAnsi="Arial"/>
-          <w:color w:val="212121"/>
-          <w:sz w:val="22"/>
-          <w:szCs w:val="22"/>
-        </w:rPr>
-        <w:t xml:space="preserve">Fuerza que el grupo de escalado automático añada una instancia nueva, y mide con precisión el tiempo transcurrido desde que la métrica de CPU supera el umbral hasta que esa instancia atiende tráfico real.</w:t>
+        <w:t xml:space="preserve">Paso 7 — Comprueba el reparto real de tráfico</w:t>
       </w:r>
     </w:p>
     <w:tbl>
@@ -1071,7 +955,7 @@
                 <w:sz w:val="20"/>
                 <w:szCs w:val="20"/>
               </w:rPr>
-              <w:t xml:space="preserve">📸 Curva de escalado con los tiempos reales medidos durante la generación de carga</w:t>
+              <w:t xml:space="preserve">📸 Salida de los seis curl, con los identificadores de instancia distintos resaltados</w:t>
             </w:r>
           </w:p>
         </w:tc>
@@ -1111,6 +995,1110 @@
                 <w:szCs w:val="20"/>
               </w:rPr>
               <w:t xml:space="preserve">[Pega aquí la captura de pantalla]</w:t>
+            </w:r>
+          </w:p>
+        </w:tc>
+      </w:tr>
+    </w:tbl>
+    <w:p>
+      <w:pPr>
+        <w:spacing w:after="200"/>
+      </w:pPr>
+    </w:p>
+    <w:p>
+      <w:pPr>
+        <w:pBdr>
+          <w:bottom w:val="single" w:color="FFA000" w:sz="4" w:space="1"/>
+        </w:pBdr>
+        <w:spacing w:after="120" w:before="240"/>
+      </w:pPr>
+      <w:r>
+        <w:rPr>
+          <w:rFonts w:ascii="Arial" w:cs="Arial" w:eastAsia="Arial" w:hAnsi="Arial"/>
+          <w:b/>
+          <w:bCs/>
+          <w:color w:val="3949AB"/>
+          <w:sz w:val="24"/>
+          <w:szCs w:val="24"/>
+        </w:rPr>
+        <w:t xml:space="preserve">Paso 8 — Apunta el frontend al balanceador, no a una instancia</w:t>
+      </w:r>
+    </w:p>
+    <w:tbl>
+      <w:tblPr>
+        <w:tblW w:type="dxa" w:w="9638"/>
+        <w:tblBorders>
+          <w:top w:val="single" w:color="auto" w:sz="4"/>
+          <w:left w:val="single" w:color="auto" w:sz="4"/>
+          <w:bottom w:val="single" w:color="auto" w:sz="4"/>
+          <w:right w:val="single" w:color="auto" w:sz="4"/>
+          <w:insideH w:val="single" w:color="auto" w:sz="4"/>
+          <w:insideV w:val="single" w:color="auto" w:sz="4"/>
+        </w:tblBorders>
+      </w:tblPr>
+      <w:tblGrid>
+        <w:gridCol w:w="9638"/>
+      </w:tblGrid>
+      <w:tr>
+        <w:tc>
+          <w:tcPr>
+            <w:tcW w:type="dxa" w:w="9638"/>
+            <w:tcBorders>
+              <w:top w:val="none" w:color="FFFFFF" w:sz="0"/>
+              <w:left w:val="none" w:color="FFFFFF" w:sz="0"/>
+              <w:bottom w:val="none" w:color="FFFFFF" w:sz="0"/>
+              <w:right w:val="none" w:color="FFFFFF" w:sz="0"/>
+            </w:tcBorders>
+            <w:shd w:fill="3949AB" w:val="clear"/>
+            <w:tcMar>
+              <w:top w:type="dxa" w:w="80"/>
+              <w:left w:type="dxa" w:w="160"/>
+              <w:bottom w:type="dxa" w:w="80"/>
+              <w:right w:type="dxa" w:w="160"/>
+            </w:tcMar>
+          </w:tcPr>
+          <w:p>
+            <w:r>
+              <w:rPr>
+                <w:rFonts w:ascii="Arial" w:cs="Arial" w:eastAsia="Arial" w:hAnsi="Arial"/>
+                <w:b/>
+                <w:bCs/>
+                <w:color w:val="FFFFFF"/>
+                <w:sz w:val="20"/>
+                <w:szCs w:val="20"/>
+              </w:rPr>
+              <w:t xml:space="preserve">📸 Frontend funcionando con la barra de direcciones visible, y el config.js actualizado mostrando el DNS del balanceador</w:t>
+            </w:r>
+          </w:p>
+        </w:tc>
+      </w:tr>
+      <w:tr>
+        <w:trPr>
+          <w:trHeight w:val="2400"/>
+        </w:trPr>
+        <w:tc>
+          <w:tcPr>
+            <w:tcW w:type="dxa" w:w="9638"/>
+            <w:tcBorders>
+              <w:top w:val="single" w:color="E0E0E0" w:sz="4"/>
+              <w:left w:val="single" w:color="E0E0E0" w:sz="4"/>
+              <w:bottom w:val="single" w:color="E0E0E0" w:sz="4"/>
+              <w:right w:val="single" w:color="E0E0E0" w:sz="4"/>
+            </w:tcBorders>
+            <w:shd w:fill="FAFAFA" w:val="clear"/>
+            <w:tcMar>
+              <w:top w:type="dxa" w:w="80"/>
+              <w:left w:type="dxa" w:w="160"/>
+              <w:bottom w:type="dxa" w:w="80"/>
+              <w:right w:type="dxa" w:w="160"/>
+            </w:tcMar>
+          </w:tcPr>
+          <w:p>
+            <w:pPr>
+              <w:jc w:val="center"/>
+            </w:pPr>
+            <w:r>
+              <w:rPr>
+                <w:rFonts w:ascii="Arial" w:cs="Arial" w:eastAsia="Arial" w:hAnsi="Arial"/>
+                <w:i/>
+                <w:iCs/>
+                <w:color w:val="757575"/>
+                <w:sz w:val="20"/>
+                <w:szCs w:val="20"/>
+              </w:rPr>
+              <w:t xml:space="preserve">[Pega aquí la captura de pantalla]</w:t>
+            </w:r>
+          </w:p>
+        </w:tc>
+      </w:tr>
+    </w:tbl>
+    <w:p>
+      <w:pPr>
+        <w:spacing w:after="200"/>
+      </w:pPr>
+    </w:p>
+    <w:p>
+      <w:r>
+        <w:br w:type="page"/>
+      </w:r>
+    </w:p>
+    <w:p>
+      <w:pPr>
+        <w:pBdr>
+          <w:bottom w:val="single" w:color="FFA000" w:sz="4" w:space="1"/>
+        </w:pBdr>
+        <w:spacing w:after="120" w:before="240"/>
+      </w:pPr>
+      <w:r>
+        <w:rPr>
+          <w:rFonts w:ascii="Arial" w:cs="Arial" w:eastAsia="Arial" w:hAnsi="Arial"/>
+          <w:b/>
+          <w:bCs/>
+          <w:color w:val="3949AB"/>
+          <w:sz w:val="24"/>
+          <w:szCs w:val="24"/>
+        </w:rPr>
+        <w:t xml:space="preserve">Paso 9 — Sube una imagen y compruébala desde otra réplica</w:t>
+      </w:r>
+    </w:p>
+    <w:tbl>
+      <w:tblPr>
+        <w:tblW w:type="dxa" w:w="9638"/>
+        <w:tblBorders>
+          <w:top w:val="single" w:color="auto" w:sz="4"/>
+          <w:left w:val="single" w:color="auto" w:sz="4"/>
+          <w:bottom w:val="single" w:color="auto" w:sz="4"/>
+          <w:right w:val="single" w:color="auto" w:sz="4"/>
+          <w:insideH w:val="single" w:color="auto" w:sz="4"/>
+          <w:insideV w:val="single" w:color="auto" w:sz="4"/>
+        </w:tblBorders>
+      </w:tblPr>
+      <w:tblGrid>
+        <w:gridCol w:w="9638"/>
+      </w:tblGrid>
+      <w:tr>
+        <w:tc>
+          <w:tcPr>
+            <w:tcW w:type="dxa" w:w="9638"/>
+            <w:tcBorders>
+              <w:top w:val="none" w:color="FFFFFF" w:sz="0"/>
+              <w:left w:val="none" w:color="FFFFFF" w:sz="0"/>
+              <w:bottom w:val="none" w:color="FFFFFF" w:sz="0"/>
+              <w:right w:val="none" w:color="FFFFFF" w:sz="0"/>
+            </w:tcBorders>
+            <w:shd w:fill="3949AB" w:val="clear"/>
+            <w:tcMar>
+              <w:top w:type="dxa" w:w="80"/>
+              <w:left w:type="dxa" w:w="160"/>
+              <w:bottom w:type="dxa" w:w="80"/>
+              <w:right w:type="dxa" w:w="160"/>
+            </w:tcMar>
+          </w:tcPr>
+          <w:p>
+            <w:r>
+              <w:rPr>
+                <w:rFonts w:ascii="Arial" w:cs="Arial" w:eastAsia="Arial" w:hAnsi="Arial"/>
+                <w:b/>
+                <w:bCs/>
+                <w:color w:val="FFFFFF"/>
+                <w:sz w:val="20"/>
+                <w:szCs w:val="20"/>
+              </w:rPr>
+              <w:t xml:space="preserve">📸 El producto con su foto visible en el catálogo, tras confirmar (por /api/instancia) que la petición la ha servido una réplica distinta a la que ha recibido la subida</w:t>
+            </w:r>
+          </w:p>
+        </w:tc>
+      </w:tr>
+      <w:tr>
+        <w:trPr>
+          <w:trHeight w:val="2400"/>
+        </w:trPr>
+        <w:tc>
+          <w:tcPr>
+            <w:tcW w:type="dxa" w:w="9638"/>
+            <w:tcBorders>
+              <w:top w:val="single" w:color="E0E0E0" w:sz="4"/>
+              <w:left w:val="single" w:color="E0E0E0" w:sz="4"/>
+              <w:bottom w:val="single" w:color="E0E0E0" w:sz="4"/>
+              <w:right w:val="single" w:color="E0E0E0" w:sz="4"/>
+            </w:tcBorders>
+            <w:shd w:fill="FAFAFA" w:val="clear"/>
+            <w:tcMar>
+              <w:top w:type="dxa" w:w="80"/>
+              <w:left w:type="dxa" w:w="160"/>
+              <w:bottom w:type="dxa" w:w="80"/>
+              <w:right w:type="dxa" w:w="160"/>
+            </w:tcMar>
+          </w:tcPr>
+          <w:p>
+            <w:pPr>
+              <w:jc w:val="center"/>
+            </w:pPr>
+            <w:r>
+              <w:rPr>
+                <w:rFonts w:ascii="Arial" w:cs="Arial" w:eastAsia="Arial" w:hAnsi="Arial"/>
+                <w:i/>
+                <w:iCs/>
+                <w:color w:val="757575"/>
+                <w:sz w:val="20"/>
+                <w:szCs w:val="20"/>
+              </w:rPr>
+              <w:t xml:space="preserve">[Pega aquí la captura de pantalla]</w:t>
+            </w:r>
+          </w:p>
+        </w:tc>
+      </w:tr>
+    </w:tbl>
+    <w:p>
+      <w:pPr>
+        <w:spacing w:after="120"/>
+      </w:pPr>
+    </w:p>
+    <w:p>
+      <w:pPr>
+        <w:spacing w:after="100"/>
+      </w:pPr>
+      <w:r>
+        <w:rPr>
+          <w:rFonts w:ascii="Arial" w:cs="Arial" w:eastAsia="Arial" w:hAnsi="Arial"/>
+          <w:color w:val="212121"/>
+          <w:sz w:val="22"/>
+          <w:szCs w:val="22"/>
+        </w:rPr>
+        <w:t xml:space="preserve">Reflexiona: antes de esta sesión, cualquiera con la IP pública de tu instancia de la 3.3 podía llegar directamente a Escaparate. Ahora esa IP ya ni siquiera existe de forma estable. ¿Qué le pasaría a un usuario que se hubiera guardado esa IP antigua, y qué te dice eso sobre por qué a un usuario nunca se le debe dar una dirección que apunte directamente a una instancia?</w:t>
+      </w:r>
+    </w:p>
+    <w:tbl>
+      <w:tblPr>
+        <w:tblW w:type="dxa" w:w="9638"/>
+        <w:tblBorders>
+          <w:top w:val="single" w:color="auto" w:sz="4"/>
+          <w:left w:val="single" w:color="auto" w:sz="4"/>
+          <w:bottom w:val="single" w:color="auto" w:sz="4"/>
+          <w:right w:val="single" w:color="auto" w:sz="4"/>
+          <w:insideH w:val="single" w:color="auto" w:sz="4"/>
+          <w:insideV w:val="single" w:color="auto" w:sz="4"/>
+        </w:tblBorders>
+      </w:tblPr>
+      <w:tblGrid>
+        <w:gridCol w:w="9638"/>
+      </w:tblGrid>
+      <w:tr>
+        <w:trPr>
+          <w:trHeight w:val="480"/>
+        </w:trPr>
+        <w:tc>
+          <w:tcPr>
+            <w:tcW w:type="dxa" w:w="9638"/>
+            <w:tcBorders>
+              <w:top w:val="single" w:color="E0E0E0" w:sz="4"/>
+              <w:left w:val="single" w:color="E0E0E0" w:sz="4"/>
+              <w:bottom w:val="single" w:color="E0E0E0" w:sz="4"/>
+              <w:right w:val="single" w:color="E0E0E0" w:sz="4"/>
+            </w:tcBorders>
+            <w:shd w:fill="FAFAFA" w:val="clear"/>
+            <w:tcMar>
+              <w:top w:type="dxa" w:w="60"/>
+              <w:left w:type="dxa" w:w="160"/>
+              <w:bottom w:type="dxa" w:w="60"/>
+              <w:right w:type="dxa" w:w="160"/>
+            </w:tcMar>
+          </w:tcPr>
+          <w:p>
+            <w:r>
+              <w:rPr>
+                <w:sz w:val="22"/>
+                <w:szCs w:val="22"/>
+              </w:rPr>
+              <w:t xml:space="preserve"/>
+            </w:r>
+          </w:p>
+        </w:tc>
+      </w:tr>
+      <w:tr>
+        <w:trPr>
+          <w:trHeight w:val="480"/>
+        </w:trPr>
+        <w:tc>
+          <w:tcPr>
+            <w:tcW w:type="dxa" w:w="9638"/>
+            <w:tcBorders>
+              <w:top w:val="single" w:color="E0E0E0" w:sz="4"/>
+              <w:left w:val="single" w:color="E0E0E0" w:sz="4"/>
+              <w:bottom w:val="single" w:color="E0E0E0" w:sz="4"/>
+              <w:right w:val="single" w:color="E0E0E0" w:sz="4"/>
+            </w:tcBorders>
+            <w:shd w:fill="FAFAFA" w:val="clear"/>
+            <w:tcMar>
+              <w:top w:type="dxa" w:w="60"/>
+              <w:left w:type="dxa" w:w="160"/>
+              <w:bottom w:type="dxa" w:w="60"/>
+              <w:right w:type="dxa" w:w="160"/>
+            </w:tcMar>
+          </w:tcPr>
+          <w:p>
+            <w:r>
+              <w:rPr>
+                <w:sz w:val="22"/>
+                <w:szCs w:val="22"/>
+              </w:rPr>
+              <w:t xml:space="preserve"/>
+            </w:r>
+          </w:p>
+        </w:tc>
+      </w:tr>
+      <w:tr>
+        <w:trPr>
+          <w:trHeight w:val="480"/>
+        </w:trPr>
+        <w:tc>
+          <w:tcPr>
+            <w:tcW w:type="dxa" w:w="9638"/>
+            <w:tcBorders>
+              <w:top w:val="single" w:color="E0E0E0" w:sz="4"/>
+              <w:left w:val="single" w:color="E0E0E0" w:sz="4"/>
+              <w:bottom w:val="single" w:color="E0E0E0" w:sz="4"/>
+              <w:right w:val="single" w:color="E0E0E0" w:sz="4"/>
+            </w:tcBorders>
+            <w:shd w:fill="FAFAFA" w:val="clear"/>
+            <w:tcMar>
+              <w:top w:type="dxa" w:w="60"/>
+              <w:left w:type="dxa" w:w="160"/>
+              <w:bottom w:type="dxa" w:w="60"/>
+              <w:right w:type="dxa" w:w="160"/>
+            </w:tcMar>
+          </w:tcPr>
+          <w:p>
+            <w:r>
+              <w:rPr>
+                <w:sz w:val="22"/>
+                <w:szCs w:val="22"/>
+              </w:rPr>
+              <w:t xml:space="preserve"/>
+            </w:r>
+          </w:p>
+        </w:tc>
+      </w:tr>
+      <w:tr>
+        <w:trPr>
+          <w:trHeight w:val="480"/>
+        </w:trPr>
+        <w:tc>
+          <w:tcPr>
+            <w:tcW w:type="dxa" w:w="9638"/>
+            <w:tcBorders>
+              <w:top w:val="single" w:color="E0E0E0" w:sz="4"/>
+              <w:left w:val="single" w:color="E0E0E0" w:sz="4"/>
+              <w:bottom w:val="single" w:color="E0E0E0" w:sz="4"/>
+              <w:right w:val="single" w:color="E0E0E0" w:sz="4"/>
+            </w:tcBorders>
+            <w:shd w:fill="FAFAFA" w:val="clear"/>
+            <w:tcMar>
+              <w:top w:type="dxa" w:w="60"/>
+              <w:left w:type="dxa" w:w="160"/>
+              <w:bottom w:type="dxa" w:w="60"/>
+              <w:right w:type="dxa" w:w="160"/>
+            </w:tcMar>
+          </w:tcPr>
+          <w:p>
+            <w:r>
+              <w:rPr>
+                <w:sz w:val="22"/>
+                <w:szCs w:val="22"/>
+              </w:rPr>
+              <w:t xml:space="preserve"/>
+            </w:r>
+          </w:p>
+        </w:tc>
+      </w:tr>
+    </w:tbl>
+    <w:p>
+      <w:pPr>
+        <w:spacing w:after="200"/>
+      </w:pPr>
+    </w:p>
+    <w:p>
+      <w:r>
+        <w:br w:type="page"/>
+      </w:r>
+    </w:p>
+    <w:p>
+      <w:pPr>
+        <w:shd w:fill="3949AB" w:val="clear"/>
+        <w:spacing w:after="0" w:before="320"/>
+        <w:ind w:left="200" w:right="200"/>
+      </w:pPr>
+      <w:r>
+        <w:rPr>
+          <w:rFonts w:ascii="Arial" w:cs="Arial" w:eastAsia="Arial" w:hAnsi="Arial"/>
+          <w:b/>
+          <w:bCs/>
+          <w:color w:val="FFFFFF"/>
+          <w:sz w:val="26"/>
+          <w:szCs w:val="26"/>
+        </w:rPr>
+        <w:t xml:space="preserve">Parte B — Reto: rompe una instancia y provoca un escalado real</w:t>
+      </w:r>
+    </w:p>
+    <w:p>
+      <w:pPr>
+        <w:spacing w:after="120"/>
+      </w:pPr>
+    </w:p>
+    <w:p>
+      <w:pPr>
+        <w:pBdr>
+          <w:bottom w:val="single" w:color="FFA000" w:sz="4" w:space="1"/>
+        </w:pBdr>
+        <w:spacing w:after="120" w:before="240"/>
+      </w:pPr>
+      <w:r>
+        <w:rPr>
+          <w:rFonts w:ascii="Arial" w:cs="Arial" w:eastAsia="Arial" w:hAnsi="Arial"/>
+          <w:b/>
+          <w:bCs/>
+          <w:color w:val="3949AB"/>
+          <w:sz w:val="24"/>
+          <w:szCs w:val="24"/>
+        </w:rPr>
+        <w:t xml:space="preserve">Termina una instancia a mano</w:t>
+      </w:r>
+    </w:p>
+    <w:tbl>
+      <w:tblPr>
+        <w:tblW w:type="dxa" w:w="9638"/>
+        <w:tblBorders>
+          <w:top w:val="single" w:color="auto" w:sz="4"/>
+          <w:left w:val="single" w:color="auto" w:sz="4"/>
+          <w:bottom w:val="single" w:color="auto" w:sz="4"/>
+          <w:right w:val="single" w:color="auto" w:sz="4"/>
+          <w:insideH w:val="single" w:color="auto" w:sz="4"/>
+          <w:insideV w:val="single" w:color="auto" w:sz="4"/>
+        </w:tblBorders>
+      </w:tblPr>
+      <w:tblGrid>
+        <w:gridCol w:w="9638"/>
+      </w:tblGrid>
+      <w:tr>
+        <w:tc>
+          <w:tcPr>
+            <w:tcW w:type="dxa" w:w="9638"/>
+            <w:tcBorders>
+              <w:top w:val="none" w:color="FFFFFF" w:sz="0"/>
+              <w:left w:val="none" w:color="FFFFFF" w:sz="0"/>
+              <w:bottom w:val="none" w:color="FFFFFF" w:sz="0"/>
+              <w:right w:val="none" w:color="FFFFFF" w:sz="0"/>
+            </w:tcBorders>
+            <w:shd w:fill="3949AB" w:val="clear"/>
+            <w:tcMar>
+              <w:top w:type="dxa" w:w="80"/>
+              <w:left w:type="dxa" w:w="160"/>
+              <w:bottom w:type="dxa" w:w="80"/>
+              <w:right w:type="dxa" w:w="160"/>
+            </w:tcMar>
+          </w:tcPr>
+          <w:p>
+            <w:r>
+              <w:rPr>
+                <w:rFonts w:ascii="Arial" w:cs="Arial" w:eastAsia="Arial" w:hAnsi="Arial"/>
+                <w:b/>
+                <w:bCs/>
+                <w:color w:val="FFFFFF"/>
+                <w:sz w:val="20"/>
+                <w:szCs w:val="20"/>
+              </w:rPr>
+              <w:t xml:space="preserve">📸 El momento en que terminas la instancia (con su ID visible) y el grupo de destino, más tarde, con dos instancias healthy de nuevo — con IDs distintos a la que has terminado</w:t>
+            </w:r>
+          </w:p>
+        </w:tc>
+      </w:tr>
+      <w:tr>
+        <w:trPr>
+          <w:trHeight w:val="2400"/>
+        </w:trPr>
+        <w:tc>
+          <w:tcPr>
+            <w:tcW w:type="dxa" w:w="9638"/>
+            <w:tcBorders>
+              <w:top w:val="single" w:color="E0E0E0" w:sz="4"/>
+              <w:left w:val="single" w:color="E0E0E0" w:sz="4"/>
+              <w:bottom w:val="single" w:color="E0E0E0" w:sz="4"/>
+              <w:right w:val="single" w:color="E0E0E0" w:sz="4"/>
+            </w:tcBorders>
+            <w:shd w:fill="FAFAFA" w:val="clear"/>
+            <w:tcMar>
+              <w:top w:type="dxa" w:w="80"/>
+              <w:left w:type="dxa" w:w="160"/>
+              <w:bottom w:type="dxa" w:w="80"/>
+              <w:right w:type="dxa" w:w="160"/>
+            </w:tcMar>
+          </w:tcPr>
+          <w:p>
+            <w:pPr>
+              <w:jc w:val="center"/>
+            </w:pPr>
+            <w:r>
+              <w:rPr>
+                <w:rFonts w:ascii="Arial" w:cs="Arial" w:eastAsia="Arial" w:hAnsi="Arial"/>
+                <w:i/>
+                <w:iCs/>
+                <w:color w:val="757575"/>
+                <w:sz w:val="20"/>
+                <w:szCs w:val="20"/>
+              </w:rPr>
+              <w:t xml:space="preserve">[Pega aquí la captura de pantalla]</w:t>
+            </w:r>
+          </w:p>
+        </w:tc>
+      </w:tr>
+    </w:tbl>
+    <w:p>
+      <w:pPr>
+        <w:spacing w:after="160"/>
+      </w:pPr>
+    </w:p>
+    <w:p>
+      <w:pPr>
+        <w:pBdr>
+          <w:bottom w:val="single" w:color="FFA000" w:sz="4" w:space="1"/>
+        </w:pBdr>
+        <w:spacing w:after="120" w:before="240"/>
+      </w:pPr>
+      <w:r>
+        <w:rPr>
+          <w:rFonts w:ascii="Arial" w:cs="Arial" w:eastAsia="Arial" w:hAnsi="Arial"/>
+          <w:b/>
+          <w:bCs/>
+          <w:color w:val="3949AB"/>
+          <w:sz w:val="24"/>
+          <w:szCs w:val="24"/>
+        </w:rPr>
+        <w:t xml:space="preserve">Genera carga real y mide el escalado</w:t>
+      </w:r>
+    </w:p>
+    <w:p>
+      <w:pPr>
+        <w:spacing w:after="100"/>
+      </w:pPr>
+      <w:r>
+        <w:rPr>
+          <w:rFonts w:ascii="Arial" w:cs="Arial" w:eastAsia="Arial" w:hAnsi="Arial"/>
+          <w:color w:val="212121"/>
+          <w:sz w:val="22"/>
+          <w:szCs w:val="22"/>
+        </w:rPr>
+        <w:t xml:space="preserve">Tu predicción (antes de generar carga): ¿cuánto tiempo crees que va a pasar desde que la CPU media supera el 50 % hasta que una instancia nueva empieza a responder tráfico de verdad?</w:t>
+      </w:r>
+    </w:p>
+    <w:tbl>
+      <w:tblPr>
+        <w:tblW w:type="dxa" w:w="9638"/>
+        <w:tblBorders>
+          <w:top w:val="single" w:color="auto" w:sz="4"/>
+          <w:left w:val="single" w:color="auto" w:sz="4"/>
+          <w:bottom w:val="single" w:color="auto" w:sz="4"/>
+          <w:right w:val="single" w:color="auto" w:sz="4"/>
+          <w:insideH w:val="single" w:color="auto" w:sz="4"/>
+          <w:insideV w:val="single" w:color="auto" w:sz="4"/>
+        </w:tblBorders>
+      </w:tblPr>
+      <w:tblGrid>
+        <w:gridCol w:w="9638"/>
+      </w:tblGrid>
+      <w:tr>
+        <w:trPr>
+          <w:trHeight w:val="480"/>
+        </w:trPr>
+        <w:tc>
+          <w:tcPr>
+            <w:tcW w:type="dxa" w:w="9638"/>
+            <w:tcBorders>
+              <w:top w:val="single" w:color="E0E0E0" w:sz="4"/>
+              <w:left w:val="single" w:color="E0E0E0" w:sz="4"/>
+              <w:bottom w:val="single" w:color="E0E0E0" w:sz="4"/>
+              <w:right w:val="single" w:color="E0E0E0" w:sz="4"/>
+            </w:tcBorders>
+            <w:shd w:fill="FAFAFA" w:val="clear"/>
+            <w:tcMar>
+              <w:top w:type="dxa" w:w="60"/>
+              <w:left w:type="dxa" w:w="160"/>
+              <w:bottom w:type="dxa" w:w="60"/>
+              <w:right w:type="dxa" w:w="160"/>
+            </w:tcMar>
+          </w:tcPr>
+          <w:p>
+            <w:r>
+              <w:rPr>
+                <w:sz w:val="22"/>
+                <w:szCs w:val="22"/>
+              </w:rPr>
+              <w:t xml:space="preserve"/>
+            </w:r>
+          </w:p>
+        </w:tc>
+      </w:tr>
+      <w:tr>
+        <w:trPr>
+          <w:trHeight w:val="480"/>
+        </w:trPr>
+        <w:tc>
+          <w:tcPr>
+            <w:tcW w:type="dxa" w:w="9638"/>
+            <w:tcBorders>
+              <w:top w:val="single" w:color="E0E0E0" w:sz="4"/>
+              <w:left w:val="single" w:color="E0E0E0" w:sz="4"/>
+              <w:bottom w:val="single" w:color="E0E0E0" w:sz="4"/>
+              <w:right w:val="single" w:color="E0E0E0" w:sz="4"/>
+            </w:tcBorders>
+            <w:shd w:fill="FAFAFA" w:val="clear"/>
+            <w:tcMar>
+              <w:top w:type="dxa" w:w="60"/>
+              <w:left w:type="dxa" w:w="160"/>
+              <w:bottom w:type="dxa" w:w="60"/>
+              <w:right w:type="dxa" w:w="160"/>
+            </w:tcMar>
+          </w:tcPr>
+          <w:p>
+            <w:r>
+              <w:rPr>
+                <w:sz w:val="22"/>
+                <w:szCs w:val="22"/>
+              </w:rPr>
+              <w:t xml:space="preserve"/>
+            </w:r>
+          </w:p>
+        </w:tc>
+      </w:tr>
+    </w:tbl>
+    <w:p>
+      <w:pPr>
+        <w:spacing w:after="120"/>
+      </w:pPr>
+    </w:p>
+    <w:tbl>
+      <w:tblPr>
+        <w:tblW w:type="dxa" w:w="9638"/>
+        <w:tblBorders>
+          <w:top w:val="single" w:color="auto" w:sz="4"/>
+          <w:left w:val="single" w:color="auto" w:sz="4"/>
+          <w:bottom w:val="single" w:color="auto" w:sz="4"/>
+          <w:right w:val="single" w:color="auto" w:sz="4"/>
+          <w:insideH w:val="single" w:color="auto" w:sz="4"/>
+          <w:insideV w:val="single" w:color="auto" w:sz="4"/>
+        </w:tblBorders>
+      </w:tblPr>
+      <w:tblGrid>
+        <w:gridCol w:w="9638"/>
+      </w:tblGrid>
+      <w:tr>
+        <w:tc>
+          <w:tcPr>
+            <w:tcW w:type="dxa" w:w="9638"/>
+            <w:tcBorders>
+              <w:top w:val="none" w:color="FFFFFF" w:sz="0"/>
+              <w:left w:val="none" w:color="FFFFFF" w:sz="0"/>
+              <w:bottom w:val="none" w:color="FFFFFF" w:sz="0"/>
+              <w:right w:val="none" w:color="FFFFFF" w:sz="0"/>
+            </w:tcBorders>
+            <w:shd w:fill="3949AB" w:val="clear"/>
+            <w:tcMar>
+              <w:top w:type="dxa" w:w="80"/>
+              <w:left w:type="dxa" w:w="160"/>
+              <w:bottom w:type="dxa" w:w="80"/>
+              <w:right w:type="dxa" w:w="160"/>
+            </w:tcMar>
+          </w:tcPr>
+          <w:p>
+            <w:r>
+              <w:rPr>
+                <w:rFonts w:ascii="Arial" w:cs="Arial" w:eastAsia="Arial" w:hAnsi="Arial"/>
+                <w:b/>
+                <w:bCs/>
+                <w:color w:val="FFFFFF"/>
+                <w:sz w:val="20"/>
+                <w:szCs w:val="20"/>
+              </w:rPr>
+              <w:t xml:space="preserve">📸 La métrica de CPU superando el 50 %, la actividad de escalado del ASG mostrando la instancia añadida con su marca de tiempo, y el tiempo real medido junto a tu predicción</w:t>
+            </w:r>
+          </w:p>
+        </w:tc>
+      </w:tr>
+      <w:tr>
+        <w:trPr>
+          <w:trHeight w:val="2400"/>
+        </w:trPr>
+        <w:tc>
+          <w:tcPr>
+            <w:tcW w:type="dxa" w:w="9638"/>
+            <w:tcBorders>
+              <w:top w:val="single" w:color="E0E0E0" w:sz="4"/>
+              <w:left w:val="single" w:color="E0E0E0" w:sz="4"/>
+              <w:bottom w:val="single" w:color="E0E0E0" w:sz="4"/>
+              <w:right w:val="single" w:color="E0E0E0" w:sz="4"/>
+            </w:tcBorders>
+            <w:shd w:fill="FAFAFA" w:val="clear"/>
+            <w:tcMar>
+              <w:top w:type="dxa" w:w="80"/>
+              <w:left w:type="dxa" w:w="160"/>
+              <w:bottom w:type="dxa" w:w="80"/>
+              <w:right w:type="dxa" w:w="160"/>
+            </w:tcMar>
+          </w:tcPr>
+          <w:p>
+            <w:pPr>
+              <w:jc w:val="center"/>
+            </w:pPr>
+            <w:r>
+              <w:rPr>
+                <w:rFonts w:ascii="Arial" w:cs="Arial" w:eastAsia="Arial" w:hAnsi="Arial"/>
+                <w:i/>
+                <w:iCs/>
+                <w:color w:val="757575"/>
+                <w:sz w:val="20"/>
+                <w:szCs w:val="20"/>
+              </w:rPr>
+              <w:t xml:space="preserve">[Pega aquí la captura de pantalla]</w:t>
+            </w:r>
+          </w:p>
+        </w:tc>
+      </w:tr>
+    </w:tbl>
+    <w:p>
+      <w:pPr>
+        <w:spacing w:after="160"/>
+      </w:pPr>
+    </w:p>
+    <w:p>
+      <w:pPr>
+        <w:pBdr>
+          <w:bottom w:val="single" w:color="FFA000" w:sz="4" w:space="1"/>
+        </w:pBdr>
+        <w:spacing w:after="120" w:before="240"/>
+      </w:pPr>
+      <w:r>
+        <w:rPr>
+          <w:rFonts w:ascii="Arial" w:cs="Arial" w:eastAsia="Arial" w:hAnsi="Arial"/>
+          <w:b/>
+          <w:bCs/>
+          <w:color w:val="3949AB"/>
+          <w:sz w:val="24"/>
+          <w:szCs w:val="24"/>
+        </w:rPr>
+        <w:t xml:space="preserve">Escala verticalmente la instancia suelta del Paso 1</w:t>
+      </w:r>
+    </w:p>
+    <w:p>
+      <w:pPr>
+        <w:spacing w:after="100"/>
+      </w:pPr>
+      <w:r>
+        <w:rPr>
+          <w:rFonts w:ascii="Arial" w:cs="Arial" w:eastAsia="Arial" w:hAnsi="Arial"/>
+          <w:color w:val="212121"/>
+          <w:sz w:val="22"/>
+          <w:szCs w:val="22"/>
+        </w:rPr>
+        <w:t xml:space="preserve">Tu predicción (antes de detener la instancia): ¿cuántos minutos crees que va a estar caído el servicio mientras cambias su tipo?</w:t>
+      </w:r>
+    </w:p>
+    <w:tbl>
+      <w:tblPr>
+        <w:tblW w:type="dxa" w:w="9638"/>
+        <w:tblBorders>
+          <w:top w:val="single" w:color="auto" w:sz="4"/>
+          <w:left w:val="single" w:color="auto" w:sz="4"/>
+          <w:bottom w:val="single" w:color="auto" w:sz="4"/>
+          <w:right w:val="single" w:color="auto" w:sz="4"/>
+          <w:insideH w:val="single" w:color="auto" w:sz="4"/>
+          <w:insideV w:val="single" w:color="auto" w:sz="4"/>
+        </w:tblBorders>
+      </w:tblPr>
+      <w:tblGrid>
+        <w:gridCol w:w="9638"/>
+      </w:tblGrid>
+      <w:tr>
+        <w:trPr>
+          <w:trHeight w:val="480"/>
+        </w:trPr>
+        <w:tc>
+          <w:tcPr>
+            <w:tcW w:type="dxa" w:w="9638"/>
+            <w:tcBorders>
+              <w:top w:val="single" w:color="E0E0E0" w:sz="4"/>
+              <w:left w:val="single" w:color="E0E0E0" w:sz="4"/>
+              <w:bottom w:val="single" w:color="E0E0E0" w:sz="4"/>
+              <w:right w:val="single" w:color="E0E0E0" w:sz="4"/>
+            </w:tcBorders>
+            <w:shd w:fill="FAFAFA" w:val="clear"/>
+            <w:tcMar>
+              <w:top w:type="dxa" w:w="60"/>
+              <w:left w:type="dxa" w:w="160"/>
+              <w:bottom w:type="dxa" w:w="60"/>
+              <w:right w:type="dxa" w:w="160"/>
+            </w:tcMar>
+          </w:tcPr>
+          <w:p>
+            <w:r>
+              <w:rPr>
+                <w:sz w:val="22"/>
+                <w:szCs w:val="22"/>
+              </w:rPr>
+              <w:t xml:space="preserve"/>
+            </w:r>
+          </w:p>
+        </w:tc>
+      </w:tr>
+      <w:tr>
+        <w:trPr>
+          <w:trHeight w:val="480"/>
+        </w:trPr>
+        <w:tc>
+          <w:tcPr>
+            <w:tcW w:type="dxa" w:w="9638"/>
+            <w:tcBorders>
+              <w:top w:val="single" w:color="E0E0E0" w:sz="4"/>
+              <w:left w:val="single" w:color="E0E0E0" w:sz="4"/>
+              <w:bottom w:val="single" w:color="E0E0E0" w:sz="4"/>
+              <w:right w:val="single" w:color="E0E0E0" w:sz="4"/>
+            </w:tcBorders>
+            <w:shd w:fill="FAFAFA" w:val="clear"/>
+            <w:tcMar>
+              <w:top w:type="dxa" w:w="60"/>
+              <w:left w:type="dxa" w:w="160"/>
+              <w:bottom w:type="dxa" w:w="60"/>
+              <w:right w:type="dxa" w:w="160"/>
+            </w:tcMar>
+          </w:tcPr>
+          <w:p>
+            <w:r>
+              <w:rPr>
+                <w:sz w:val="22"/>
+                <w:szCs w:val="22"/>
+              </w:rPr>
+              <w:t xml:space="preserve"/>
+            </w:r>
+          </w:p>
+        </w:tc>
+      </w:tr>
+    </w:tbl>
+    <w:p>
+      <w:pPr>
+        <w:spacing w:after="120"/>
+      </w:pPr>
+    </w:p>
+    <w:tbl>
+      <w:tblPr>
+        <w:tblW w:type="dxa" w:w="9638"/>
+        <w:tblBorders>
+          <w:top w:val="single" w:color="auto" w:sz="4"/>
+          <w:left w:val="single" w:color="auto" w:sz="4"/>
+          <w:bottom w:val="single" w:color="auto" w:sz="4"/>
+          <w:right w:val="single" w:color="auto" w:sz="4"/>
+          <w:insideH w:val="single" w:color="auto" w:sz="4"/>
+          <w:insideV w:val="single" w:color="auto" w:sz="4"/>
+        </w:tblBorders>
+      </w:tblPr>
+      <w:tblGrid>
+        <w:gridCol w:w="9638"/>
+      </w:tblGrid>
+      <w:tr>
+        <w:tc>
+          <w:tcPr>
+            <w:tcW w:type="dxa" w:w="9638"/>
+            <w:tcBorders>
+              <w:top w:val="none" w:color="FFFFFF" w:sz="0"/>
+              <w:left w:val="none" w:color="FFFFFF" w:sz="0"/>
+              <w:bottom w:val="none" w:color="FFFFFF" w:sz="0"/>
+              <w:right w:val="none" w:color="FFFFFF" w:sz="0"/>
+            </w:tcBorders>
+            <w:shd w:fill="3949AB" w:val="clear"/>
+            <w:tcMar>
+              <w:top w:type="dxa" w:w="80"/>
+              <w:left w:type="dxa" w:w="160"/>
+              <w:bottom w:type="dxa" w:w="80"/>
+              <w:right w:type="dxa" w:w="160"/>
+            </w:tcMar>
+          </w:tcPr>
+          <w:p>
+            <w:r>
+              <w:rPr>
+                <w:rFonts w:ascii="Arial" w:cs="Arial" w:eastAsia="Arial" w:hAnsi="Arial"/>
+                <w:b/>
+                <w:bCs/>
+                <w:color w:val="FFFFFF"/>
+                <w:sz w:val="20"/>
+                <w:szCs w:val="20"/>
+              </w:rPr>
+              <w:t xml:space="preserve">📸 Listado de instancias mostrando el cambio de tipo (t3.small → t3.xlarge), hora de detención y hora del primer 200 tras el cambio, y salida de nproc/free -h después del cambio</w:t>
+            </w:r>
+          </w:p>
+        </w:tc>
+      </w:tr>
+      <w:tr>
+        <w:trPr>
+          <w:trHeight w:val="2400"/>
+        </w:trPr>
+        <w:tc>
+          <w:tcPr>
+            <w:tcW w:type="dxa" w:w="9638"/>
+            <w:tcBorders>
+              <w:top w:val="single" w:color="E0E0E0" w:sz="4"/>
+              <w:left w:val="single" w:color="E0E0E0" w:sz="4"/>
+              <w:bottom w:val="single" w:color="E0E0E0" w:sz="4"/>
+              <w:right w:val="single" w:color="E0E0E0" w:sz="4"/>
+            </w:tcBorders>
+            <w:shd w:fill="FAFAFA" w:val="clear"/>
+            <w:tcMar>
+              <w:top w:type="dxa" w:w="80"/>
+              <w:left w:type="dxa" w:w="160"/>
+              <w:bottom w:type="dxa" w:w="80"/>
+              <w:right w:type="dxa" w:w="160"/>
+            </w:tcMar>
+          </w:tcPr>
+          <w:p>
+            <w:pPr>
+              <w:jc w:val="center"/>
+            </w:pPr>
+            <w:r>
+              <w:rPr>
+                <w:rFonts w:ascii="Arial" w:cs="Arial" w:eastAsia="Arial" w:hAnsi="Arial"/>
+                <w:i/>
+                <w:iCs/>
+                <w:color w:val="757575"/>
+                <w:sz w:val="20"/>
+                <w:szCs w:val="20"/>
+              </w:rPr>
+              <w:t xml:space="preserve">[Pega aquí la captura de pantalla]</w:t>
+            </w:r>
+          </w:p>
+        </w:tc>
+      </w:tr>
+    </w:tbl>
+    <w:p>
+      <w:pPr>
+        <w:spacing w:after="160"/>
+      </w:pPr>
+    </w:p>
+    <w:p>
+      <w:pPr>
+        <w:pBdr>
+          <w:bottom w:val="single" w:color="FFA000" w:sz="4" w:space="1"/>
+        </w:pBdr>
+        <w:spacing w:after="120" w:before="240"/>
+      </w:pPr>
+      <w:r>
+        <w:rPr>
+          <w:rFonts w:ascii="Arial" w:cs="Arial" w:eastAsia="Arial" w:hAnsi="Arial"/>
+          <w:b/>
+          <w:bCs/>
+          <w:color w:val="3949AB"/>
+          <w:sz w:val="24"/>
+          <w:szCs w:val="24"/>
+        </w:rPr>
+        <w:t xml:space="preserve">Explica los tres incidentes</w:t>
+      </w:r>
+    </w:p>
+    <w:p>
+      <w:pPr>
+        <w:spacing w:after="100"/>
+      </w:pPr>
+      <w:r>
+        <w:rPr>
+          <w:rFonts w:ascii="Arial" w:cs="Arial" w:eastAsia="Arial" w:hAnsi="Arial"/>
+          <w:color w:val="212121"/>
+          <w:sz w:val="22"/>
+          <w:szCs w:val="22"/>
+        </w:rPr>
+        <w:t xml:space="preserve">Para cada uno de los tres incidentes: ¿qué mecanismo concreto ha respondido? (comprobación de salud + reposición automática en el primero; política de escalado por CPU en el segundo; cambio manual de tipo de instancia, sin disparador automático, en el tercero).</w:t>
+      </w:r>
+    </w:p>
+    <w:tbl>
+      <w:tblPr>
+        <w:tblW w:type="dxa" w:w="9638"/>
+        <w:tblBorders>
+          <w:top w:val="single" w:color="auto" w:sz="4"/>
+          <w:left w:val="single" w:color="auto" w:sz="4"/>
+          <w:bottom w:val="single" w:color="auto" w:sz="4"/>
+          <w:right w:val="single" w:color="auto" w:sz="4"/>
+          <w:insideH w:val="single" w:color="auto" w:sz="4"/>
+          <w:insideV w:val="single" w:color="auto" w:sz="4"/>
+        </w:tblBorders>
+      </w:tblPr>
+      <w:tblGrid>
+        <w:gridCol w:w="9638"/>
+      </w:tblGrid>
+      <w:tr>
+        <w:trPr>
+          <w:trHeight w:val="480"/>
+        </w:trPr>
+        <w:tc>
+          <w:tcPr>
+            <w:tcW w:type="dxa" w:w="9638"/>
+            <w:tcBorders>
+              <w:top w:val="single" w:color="E0E0E0" w:sz="4"/>
+              <w:left w:val="single" w:color="E0E0E0" w:sz="4"/>
+              <w:bottom w:val="single" w:color="E0E0E0" w:sz="4"/>
+              <w:right w:val="single" w:color="E0E0E0" w:sz="4"/>
+            </w:tcBorders>
+            <w:shd w:fill="FAFAFA" w:val="clear"/>
+            <w:tcMar>
+              <w:top w:type="dxa" w:w="60"/>
+              <w:left w:type="dxa" w:w="160"/>
+              <w:bottom w:type="dxa" w:w="60"/>
+              <w:right w:type="dxa" w:w="160"/>
+            </w:tcMar>
+          </w:tcPr>
+          <w:p>
+            <w:r>
+              <w:rPr>
+                <w:sz w:val="22"/>
+                <w:szCs w:val="22"/>
+              </w:rPr>
+              <w:t xml:space="preserve"/>
+            </w:r>
+          </w:p>
+        </w:tc>
+      </w:tr>
+      <w:tr>
+        <w:trPr>
+          <w:trHeight w:val="480"/>
+        </w:trPr>
+        <w:tc>
+          <w:tcPr>
+            <w:tcW w:type="dxa" w:w="9638"/>
+            <w:tcBorders>
+              <w:top w:val="single" w:color="E0E0E0" w:sz="4"/>
+              <w:left w:val="single" w:color="E0E0E0" w:sz="4"/>
+              <w:bottom w:val="single" w:color="E0E0E0" w:sz="4"/>
+              <w:right w:val="single" w:color="E0E0E0" w:sz="4"/>
+            </w:tcBorders>
+            <w:shd w:fill="FAFAFA" w:val="clear"/>
+            <w:tcMar>
+              <w:top w:type="dxa" w:w="60"/>
+              <w:left w:type="dxa" w:w="160"/>
+              <w:bottom w:type="dxa" w:w="60"/>
+              <w:right w:type="dxa" w:w="160"/>
+            </w:tcMar>
+          </w:tcPr>
+          <w:p>
+            <w:r>
+              <w:rPr>
+                <w:sz w:val="22"/>
+                <w:szCs w:val="22"/>
+              </w:rPr>
+              <w:t xml:space="preserve"/>
+            </w:r>
+          </w:p>
+        </w:tc>
+      </w:tr>
+      <w:tr>
+        <w:trPr>
+          <w:trHeight w:val="480"/>
+        </w:trPr>
+        <w:tc>
+          <w:tcPr>
+            <w:tcW w:type="dxa" w:w="9638"/>
+            <w:tcBorders>
+              <w:top w:val="single" w:color="E0E0E0" w:sz="4"/>
+              <w:left w:val="single" w:color="E0E0E0" w:sz="4"/>
+              <w:bottom w:val="single" w:color="E0E0E0" w:sz="4"/>
+              <w:right w:val="single" w:color="E0E0E0" w:sz="4"/>
+            </w:tcBorders>
+            <w:shd w:fill="FAFAFA" w:val="clear"/>
+            <w:tcMar>
+              <w:top w:type="dxa" w:w="60"/>
+              <w:left w:type="dxa" w:w="160"/>
+              <w:bottom w:type="dxa" w:w="60"/>
+              <w:right w:type="dxa" w:w="160"/>
+            </w:tcMar>
+          </w:tcPr>
+          <w:p>
+            <w:r>
+              <w:rPr>
+                <w:sz w:val="22"/>
+                <w:szCs w:val="22"/>
+              </w:rPr>
+              <w:t xml:space="preserve"/>
             </w:r>
           </w:p>
         </w:tc>

</xml_diff>

<commit_message>
Deployed 99fb420 with MkDocs version: 1.6.1
</commit_message>
<xml_diff>
--- a/tema4/plantillas/Actividad_4_1_INU_Plantilla.docx
+++ b/tema4/plantillas/Actividad_4_1_INU_Plantilla.docx
@@ -497,7 +497,7 @@
                 <w:sz w:val="20"/>
                 <w:szCs w:val="20"/>
               </w:rPr>
-              <w:t xml:space="preserve">📸 Las dos reglas de entrada, cada una en su grupo de seguridad, mostrando el origen exacto de cada una</w:t>
+              <w:t xml:space="preserve">📸 Las dos reglas de entrada, cada una en su grupo de seguridad, mostrando el origen exacto de cada una, y la regla de salida de escaparate-alb-sg</w:t>
             </w:r>
           </w:p>
         </w:tc>
@@ -1184,7 +1184,7 @@
                 <w:sz w:val="20"/>
                 <w:szCs w:val="20"/>
               </w:rPr>
-              <w:t xml:space="preserve">📸 El producto con su foto visible en el catálogo, tras confirmar (por /api/instancia) que la petición la ha servido una réplica distinta a la que ha recibido la subida</w:t>
+              <w:t xml:space="preserve">📸 El producto con su foto visible en el catálogo, con el panel de información de la instancia mostrando un identificador distinto al de la subida</w:t>
             </w:r>
           </w:p>
         </w:tc>
@@ -1909,7 +1909,7 @@
                 <w:sz w:val="20"/>
                 <w:szCs w:val="20"/>
               </w:rPr>
-              <w:t xml:space="preserve">📸 Listado de instancias mostrando el cambio de tipo (t3.small → t3.xlarge), hora de detención y hora del primer 200 tras el cambio, y salida de nproc/free -h después del cambio</w:t>
+              <w:t xml:space="preserve">📸 Listado de instancias mostrando el cambio de tipo (t3.small → t3.large), hora de detención y hora del primer 200 tras el cambio, y salida de free -h después del cambio</w:t>
             </w:r>
           </w:p>
         </w:tc>

</xml_diff>